<commit_message>
done report of industry
</commit_message>
<xml_diff>
--- a/backend/exports/workshop-test/sample-workshop-report.docx
+++ b/backend/exports/workshop-test/sample-workshop-report.docx
@@ -266,22 +266,6 @@
     </w:p>
     <w:p>
       <w:pPr>
-        <w:spacing w:after="160"/>
-        <w:jc w:val="center"/>
-      </w:pPr>
-      <w:r>
-        <w:rPr>
-          <w:rFonts w:ascii="Times New Roman" w:cs="Times New Roman" w:eastAsia="Times New Roman" w:hAnsi="Times New Roman"/>
-          <w:i/>
-          <w:iCs/>
-          <w:sz w:val="24"/>
-          <w:szCs w:val="24"/>
-        </w:rPr>
-        <w:t xml:space="preserve">Workshop banner</w:t>
-      </w:r>
-    </w:p>
-    <w:p>
-      <w:pPr>
         <w:spacing w:after="120" w:before="200" w:line="240"/>
         <w:jc w:val="left"/>
       </w:pPr>
@@ -396,22 +380,6 @@
           <w:szCs w:val="24"/>
         </w:rPr>
         <w:t xml:space="preserve">The workshop commenced with a welcome address followed by the technical session delivered by the resource person.</w:t>
-      </w:r>
-    </w:p>
-    <w:p>
-      <w:pPr>
-        <w:spacing w:after="160"/>
-        <w:jc w:val="center"/>
-      </w:pPr>
-      <w:r>
-        <w:rPr>
-          <w:rFonts w:ascii="Times New Roman" w:cs="Times New Roman" w:eastAsia="Times New Roman" w:hAnsi="Times New Roman"/>
-          <w:i/>
-          <w:iCs/>
-          <w:sz w:val="24"/>
-          <w:szCs w:val="24"/>
-        </w:rPr>
-        <w:t xml:space="preserve">Speaker session</w:t>
       </w:r>
     </w:p>
     <w:p>

</xml_diff>